<commit_message>
Bộ mẫu HTTT cấp độ 1–2: Word, Excel, liên kết README
- docs/08-bo-mau-cap-1-2: README, phiếu sàng lọc, QĐ phân công, Quy chế rút gọn,
  hồ sơ đề xuất cấp độ gộp, Mẫu 01, biên bản thẩm định, QĐ phê duyệt do đơn vị
  chuyên trách ban hành, quy trình sự cố rút gọn, kế hoạch ANM năm, nguồn Excel
- templates/08-bo-mau-cap-1-2: 9 Word + checklist-cap-1-2.xlsx (tự lọc theo cấp)
- md2docx: dữ liệu mẫu theo thư mục; ước lượng độ rộng cột theo đúng phần tử mảng
- checklist cấp 1/2 (docs/03): bổ sung, chỉnh theo TCVN 14423:2026
- diem-can-doi-chieu: C18 thủ tục cấp 1–2

Co-Authored-By: Claude Opus 5.5 <noreply@anthropic.com>
Claude-Session: https://claude.ai/code/session_01EYfrLZFALxho7iwpK7bTVa
</commit_message>
<xml_diff>
--- a/templates/04-chinh-sach-quy-trinh/qd-thanh-lap-hoi-dong-tham-dinh.docx
+++ b/templates/04-chinh-sach-quy-trinh/qd-thanh-lap-hoi-dong-tham-dinh.docx
@@ -676,10 +676,10 @@
       </w:tblPr>
       <w:tblGrid>
         <w:gridCol w:w="672"/>
-        <w:gridCol w:w="1531"/>
-        <w:gridCol w:w="2057"/>
-        <w:gridCol w:w="2774"/>
-        <w:gridCol w:w="1991"/>
+        <w:gridCol w:w="1773"/>
+        <w:gridCol w:w="2345"/>
+        <w:gridCol w:w="2460"/>
+        <w:gridCol w:w="1775"/>
       </w:tblGrid>
       <w:tr>
         <w:trPr>
@@ -726,7 +726,7 @@
         </w:tc>
         <w:tc>
           <w:tcPr>
-            <w:tcW w:type="dxa" w:w="1531"/>
+            <w:tcW w:type="dxa" w:w="1773"/>
             <w:tcBorders>
               <w:top w:val="single" w:color="000000" w:sz="4"/>
               <w:left w:val="single" w:color="000000" w:sz="4"/>
@@ -764,7 +764,7 @@
         </w:tc>
         <w:tc>
           <w:tcPr>
-            <w:tcW w:type="dxa" w:w="2057"/>
+            <w:tcW w:type="dxa" w:w="2345"/>
             <w:tcBorders>
               <w:top w:val="single" w:color="000000" w:sz="4"/>
               <w:left w:val="single" w:color="000000" w:sz="4"/>
@@ -802,7 +802,7 @@
         </w:tc>
         <w:tc>
           <w:tcPr>
-            <w:tcW w:type="dxa" w:w="2774"/>
+            <w:tcW w:type="dxa" w:w="2460"/>
             <w:tcBorders>
               <w:top w:val="single" w:color="000000" w:sz="4"/>
               <w:left w:val="single" w:color="000000" w:sz="4"/>
@@ -840,7 +840,7 @@
         </w:tc>
         <w:tc>
           <w:tcPr>
-            <w:tcW w:type="dxa" w:w="1991"/>
+            <w:tcW w:type="dxa" w:w="1775"/>
             <w:tcBorders>
               <w:top w:val="single" w:color="000000" w:sz="4"/>
               <w:left w:val="single" w:color="000000" w:sz="4"/>
@@ -921,7 +921,7 @@
         </w:tc>
         <w:tc>
           <w:tcPr>
-            <w:tcW w:type="dxa" w:w="1531"/>
+            <w:tcW w:type="dxa" w:w="1773"/>
             <w:tcBorders>
               <w:top w:val="single" w:color="000000" w:sz="4"/>
               <w:left w:val="single" w:color="000000" w:sz="4"/>
@@ -959,7 +959,7 @@
         </w:tc>
         <w:tc>
           <w:tcPr>
-            <w:tcW w:type="dxa" w:w="2057"/>
+            <w:tcW w:type="dxa" w:w="2345"/>
             <w:tcBorders>
               <w:top w:val="single" w:color="000000" w:sz="4"/>
               <w:left w:val="single" w:color="000000" w:sz="4"/>
@@ -997,7 +997,7 @@
         </w:tc>
         <w:tc>
           <w:tcPr>
-            <w:tcW w:type="dxa" w:w="2774"/>
+            <w:tcW w:type="dxa" w:w="2460"/>
             <w:tcBorders>
               <w:top w:val="single" w:color="000000" w:sz="4"/>
               <w:left w:val="single" w:color="000000" w:sz="4"/>
@@ -1034,7 +1034,7 @@
         </w:tc>
         <w:tc>
           <w:tcPr>
-            <w:tcW w:type="dxa" w:w="1991"/>
+            <w:tcW w:type="dxa" w:w="1775"/>
             <w:tcBorders>
               <w:top w:val="single" w:color="000000" w:sz="4"/>
               <w:left w:val="single" w:color="000000" w:sz="4"/>
@@ -1115,7 +1115,7 @@
         </w:tc>
         <w:tc>
           <w:tcPr>
-            <w:tcW w:type="dxa" w:w="1531"/>
+            <w:tcW w:type="dxa" w:w="1773"/>
             <w:tcBorders>
               <w:top w:val="single" w:color="000000" w:sz="4"/>
               <w:left w:val="single" w:color="000000" w:sz="4"/>
@@ -1153,7 +1153,7 @@
         </w:tc>
         <w:tc>
           <w:tcPr>
-            <w:tcW w:type="dxa" w:w="2057"/>
+            <w:tcW w:type="dxa" w:w="2345"/>
             <w:tcBorders>
               <w:top w:val="single" w:color="000000" w:sz="4"/>
               <w:left w:val="single" w:color="000000" w:sz="4"/>
@@ -1191,7 +1191,7 @@
         </w:tc>
         <w:tc>
           <w:tcPr>
-            <w:tcW w:type="dxa" w:w="2774"/>
+            <w:tcW w:type="dxa" w:w="2460"/>
             <w:tcBorders>
               <w:top w:val="single" w:color="000000" w:sz="4"/>
               <w:left w:val="single" w:color="000000" w:sz="4"/>
@@ -1228,7 +1228,7 @@
         </w:tc>
         <w:tc>
           <w:tcPr>
-            <w:tcW w:type="dxa" w:w="1991"/>
+            <w:tcW w:type="dxa" w:w="1775"/>
             <w:tcBorders>
               <w:top w:val="single" w:color="000000" w:sz="4"/>
               <w:left w:val="single" w:color="000000" w:sz="4"/>
@@ -1296,7 +1296,7 @@
         </w:tc>
         <w:tc>
           <w:tcPr>
-            <w:tcW w:type="dxa" w:w="1531"/>
+            <w:tcW w:type="dxa" w:w="1773"/>
             <w:tcBorders>
               <w:top w:val="single" w:color="000000" w:sz="4"/>
               <w:left w:val="single" w:color="000000" w:sz="4"/>
@@ -1334,7 +1334,7 @@
         </w:tc>
         <w:tc>
           <w:tcPr>
-            <w:tcW w:type="dxa" w:w="2057"/>
+            <w:tcW w:type="dxa" w:w="2345"/>
             <w:tcBorders>
               <w:top w:val="single" w:color="000000" w:sz="4"/>
               <w:left w:val="single" w:color="000000" w:sz="4"/>
@@ -1372,7 +1372,7 @@
         </w:tc>
         <w:tc>
           <w:tcPr>
-            <w:tcW w:type="dxa" w:w="2774"/>
+            <w:tcW w:type="dxa" w:w="2460"/>
             <w:tcBorders>
               <w:top w:val="single" w:color="000000" w:sz="4"/>
               <w:left w:val="single" w:color="000000" w:sz="4"/>
@@ -1409,7 +1409,7 @@
         </w:tc>
         <w:tc>
           <w:tcPr>
-            <w:tcW w:type="dxa" w:w="1991"/>
+            <w:tcW w:type="dxa" w:w="1775"/>
             <w:tcBorders>
               <w:top w:val="single" w:color="000000" w:sz="4"/>
               <w:left w:val="single" w:color="000000" w:sz="4"/>
@@ -1477,7 +1477,7 @@
         </w:tc>
         <w:tc>
           <w:tcPr>
-            <w:tcW w:type="dxa" w:w="1531"/>
+            <w:tcW w:type="dxa" w:w="1773"/>
             <w:tcBorders>
               <w:top w:val="single" w:color="000000" w:sz="4"/>
               <w:left w:val="single" w:color="000000" w:sz="4"/>
@@ -1515,7 +1515,7 @@
         </w:tc>
         <w:tc>
           <w:tcPr>
-            <w:tcW w:type="dxa" w:w="2057"/>
+            <w:tcW w:type="dxa" w:w="2345"/>
             <w:tcBorders>
               <w:top w:val="single" w:color="000000" w:sz="4"/>
               <w:left w:val="single" w:color="000000" w:sz="4"/>
@@ -1553,7 +1553,7 @@
         </w:tc>
         <w:tc>
           <w:tcPr>
-            <w:tcW w:type="dxa" w:w="2774"/>
+            <w:tcW w:type="dxa" w:w="2460"/>
             <w:tcBorders>
               <w:top w:val="single" w:color="000000" w:sz="4"/>
               <w:left w:val="single" w:color="000000" w:sz="4"/>
@@ -1590,7 +1590,7 @@
         </w:tc>
         <w:tc>
           <w:tcPr>
-            <w:tcW w:type="dxa" w:w="1991"/>
+            <w:tcW w:type="dxa" w:w="1775"/>
             <w:tcBorders>
               <w:top w:val="single" w:color="000000" w:sz="4"/>
               <w:left w:val="single" w:color="000000" w:sz="4"/>
@@ -1658,7 +1658,7 @@
         </w:tc>
         <w:tc>
           <w:tcPr>
-            <w:tcW w:type="dxa" w:w="1531"/>
+            <w:tcW w:type="dxa" w:w="1773"/>
             <w:tcBorders>
               <w:top w:val="single" w:color="000000" w:sz="4"/>
               <w:left w:val="single" w:color="000000" w:sz="4"/>
@@ -1696,7 +1696,7 @@
         </w:tc>
         <w:tc>
           <w:tcPr>
-            <w:tcW w:type="dxa" w:w="2057"/>
+            <w:tcW w:type="dxa" w:w="2345"/>
             <w:tcBorders>
               <w:top w:val="single" w:color="000000" w:sz="4"/>
               <w:left w:val="single" w:color="000000" w:sz="4"/>
@@ -1734,7 +1734,7 @@
         </w:tc>
         <w:tc>
           <w:tcPr>
-            <w:tcW w:type="dxa" w:w="2774"/>
+            <w:tcW w:type="dxa" w:w="2460"/>
             <w:tcBorders>
               <w:top w:val="single" w:color="000000" w:sz="4"/>
               <w:left w:val="single" w:color="000000" w:sz="4"/>
@@ -1771,7 +1771,7 @@
         </w:tc>
         <w:tc>
           <w:tcPr>
-            <w:tcW w:type="dxa" w:w="1991"/>
+            <w:tcW w:type="dxa" w:w="1775"/>
             <w:tcBorders>
               <w:top w:val="single" w:color="000000" w:sz="4"/>
               <w:left w:val="single" w:color="000000" w:sz="4"/>
@@ -1839,7 +1839,7 @@
         </w:tc>
         <w:tc>
           <w:tcPr>
-            <w:tcW w:type="dxa" w:w="1531"/>
+            <w:tcW w:type="dxa" w:w="1773"/>
             <w:tcBorders>
               <w:top w:val="single" w:color="000000" w:sz="4"/>
               <w:left w:val="single" w:color="000000" w:sz="4"/>
@@ -1877,7 +1877,7 @@
         </w:tc>
         <w:tc>
           <w:tcPr>
-            <w:tcW w:type="dxa" w:w="2057"/>
+            <w:tcW w:type="dxa" w:w="2345"/>
             <w:tcBorders>
               <w:top w:val="single" w:color="000000" w:sz="4"/>
               <w:left w:val="single" w:color="000000" w:sz="4"/>
@@ -1915,7 +1915,7 @@
         </w:tc>
         <w:tc>
           <w:tcPr>
-            <w:tcW w:type="dxa" w:w="2774"/>
+            <w:tcW w:type="dxa" w:w="2460"/>
             <w:tcBorders>
               <w:top w:val="single" w:color="000000" w:sz="4"/>
               <w:left w:val="single" w:color="000000" w:sz="4"/>
@@ -1952,7 +1952,7 @@
         </w:tc>
         <w:tc>
           <w:tcPr>
-            <w:tcW w:type="dxa" w:w="1991"/>
+            <w:tcW w:type="dxa" w:w="1775"/>
             <w:tcBorders>
               <w:top w:val="single" w:color="000000" w:sz="4"/>
               <w:left w:val="single" w:color="000000" w:sz="4"/>

</xml_diff>